<commit_message>
Modificar enmienda, sin imagenes
</commit_message>
<xml_diff>
--- a/src/main/plantillas/Enmienda.docx
+++ b/src/main/plantillas/Enmienda.docx
@@ -89,8 +89,7 @@
           <w:rFonts w:ascii="Arial"/>
           <w:b/>
           <w:color w:val="000000" w:themeColor="text1"/>
-          <w:sz w:val="20"/>
-          <w:szCs w:val="20"/>
+          <w:u w:val="single"/>
         </w:rPr>
       </w:pPr>
       <w:r>
@@ -98,9 +97,7 @@
           <w:rFonts w:ascii="Arial"/>
           <w:b/>
           <w:color w:val="000000" w:themeColor="text1"/>
-          <w:sz w:val="20"/>
-          <w:szCs w:val="20"/>
-          <w:u w:val="thick"/>
+          <w:u w:val="single"/>
         </w:rPr>
         <w:t>Constancia</w:t>
       </w:r>
@@ -197,7 +194,21 @@
           <w:rFonts w:ascii="Arial" w:eastAsia="Calibri" w:hAnsi="Arial" w:cs="Arial"/>
           <w:lang w:val="es-PE"/>
         </w:rPr>
-        <w:t>Código de Registro:</w:t>
+        <w:t xml:space="preserve">Código de </w:t>
+      </w:r>
+      <w:r>
+        <w:rPr>
+          <w:rFonts w:ascii="Arial" w:eastAsia="Calibri" w:hAnsi="Arial" w:cs="Arial"/>
+          <w:lang w:val="es-PE"/>
+        </w:rPr>
+        <w:t>r</w:t>
+      </w:r>
+      <w:r>
+        <w:rPr>
+          <w:rFonts w:ascii="Arial" w:eastAsia="Calibri" w:hAnsi="Arial" w:cs="Arial"/>
+          <w:lang w:val="es-PE"/>
+        </w:rPr>
+        <w:t>egistro:</w:t>
       </w:r>
       <w:r>
         <w:rPr>
@@ -311,7 +322,31 @@
           <w:color w:val="000000"/>
           <w:lang w:val="es-PE" w:eastAsia="es-ES"/>
         </w:rPr>
-        <w:t>Investigador(a):</w:t>
+        <w:t>Investigador</w:t>
+      </w:r>
+      <w:r>
+        <w:rPr>
+          <w:rFonts w:ascii="Arial" w:eastAsia="Times New Roman" w:hAnsi="Arial" w:cs="Arial"/>
+          <w:color w:val="000000"/>
+          <w:lang w:val="es-PE" w:eastAsia="es-ES"/>
+        </w:rPr>
+        <w:t>(</w:t>
+      </w:r>
+      <w:r>
+        <w:rPr>
+          <w:rFonts w:ascii="Arial" w:eastAsia="Times New Roman" w:hAnsi="Arial" w:cs="Arial"/>
+          <w:color w:val="000000"/>
+          <w:lang w:val="es-PE" w:eastAsia="es-ES"/>
+        </w:rPr>
+        <w:t>es</w:t>
+      </w:r>
+      <w:r>
+        <w:rPr>
+          <w:rFonts w:ascii="Arial" w:eastAsia="Times New Roman" w:hAnsi="Arial" w:cs="Arial"/>
+          <w:color w:val="000000"/>
+          <w:lang w:val="es-PE" w:eastAsia="es-ES"/>
+        </w:rPr>
+        <w:t>):</w:t>
       </w:r>
       <w:r>
         <w:rPr>
@@ -361,7 +396,15 @@
           <w:color w:val="000000"/>
           <w:lang w:val="es-PE" w:eastAsia="es-ES"/>
         </w:rPr>
-        <w:t>Constancia de aprobación:</w:t>
+        <w:t>Documentos vinculados</w:t>
+      </w:r>
+      <w:r>
+        <w:rPr>
+          <w:rFonts w:ascii="Arial" w:eastAsia="Times New Roman" w:hAnsi="Arial" w:cs="Arial"/>
+          <w:color w:val="000000"/>
+          <w:lang w:val="es-PE" w:eastAsia="es-ES"/>
+        </w:rPr>
+        <w:t>:</w:t>
       </w:r>
       <w:r>
         <w:rPr>
@@ -565,7 +608,7 @@
           <w:b/>
           <w:bCs/>
         </w:rPr>
-        <w:t>AprHasta</w:t>
+        <w:t>fechaIngreso</w:t>
       </w:r>
       <w:proofErr w:type="spellEnd"/>
       <w:r>
@@ -1141,8 +1184,6 @@
       <w:r>
         <w:rPr>
           <w:rFonts w:ascii="Arial" w:eastAsia="Calibri" w:hAnsi="Arial" w:cs="Arial"/>
-          <w:b/>
-          <w:bCs/>
         </w:rPr>
         <w:t>${</w:t>
       </w:r>
@@ -1150,18 +1191,14 @@
       <w:r>
         <w:rPr>
           <w:rFonts w:ascii="Arial" w:eastAsia="Calibri" w:hAnsi="Arial" w:cs="Arial"/>
-          <w:b/>
-          <w:bCs/>
           <w:lang w:val="es-PE"/>
         </w:rPr>
-        <w:t>AprDesde</w:t>
+        <w:t>fechaCiei</w:t>
       </w:r>
       <w:proofErr w:type="spellEnd"/>
       <w:r>
         <w:rPr>
           <w:rFonts w:ascii="Arial" w:eastAsia="Calibri" w:hAnsi="Arial" w:cs="Arial"/>
-          <w:b/>
-          <w:bCs/>
         </w:rPr>
         <w:t>}</w:t>
       </w:r>
@@ -1189,87 +1226,31 @@
       </w:pPr>
       <w:r>
         <w:rPr>
-          <w:rFonts w:ascii="Arial" w:eastAsia="Calibri" w:hAnsi="Arial" w:cs="Arial"/>
-          <w:noProof/>
-          <w:lang w:val="es-PE"/>
-        </w:rPr>
-        <w:drawing>
-          <wp:anchor distT="0" distB="0" distL="114300" distR="114300" simplePos="0" relativeHeight="251660288" behindDoc="1" locked="0" layoutInCell="1" allowOverlap="1" wp14:anchorId="36059C32" wp14:editId="5D932D58">
-            <wp:simplePos x="0" y="0"/>
-            <wp:positionH relativeFrom="margin">
-              <wp:posOffset>1108075</wp:posOffset>
-            </wp:positionH>
-            <wp:positionV relativeFrom="paragraph">
-              <wp:posOffset>571500</wp:posOffset>
-            </wp:positionV>
-            <wp:extent cx="2715895" cy="1503045"/>
-            <wp:effectExtent l="0" t="0" r="8255" b="1905"/>
-            <wp:wrapThrough wrapText="bothSides">
-              <wp:wrapPolygon edited="0">
-                <wp:start x="0" y="0"/>
-                <wp:lineTo x="0" y="21354"/>
-                <wp:lineTo x="21514" y="21354"/>
-                <wp:lineTo x="21514" y="0"/>
-                <wp:lineTo x="0" y="0"/>
-              </wp:wrapPolygon>
-            </wp:wrapThrough>
-            <wp:docPr id="1" name="Imagen 1" descr="Texto, Carta&#10;&#10;Descripción generada automáticamente"/>
-            <wp:cNvGraphicFramePr>
-              <a:graphicFrameLocks xmlns:a="http://schemas.openxmlformats.org/drawingml/2006/main" noChangeAspect="1"/>
-            </wp:cNvGraphicFramePr>
-            <a:graphic xmlns:a="http://schemas.openxmlformats.org/drawingml/2006/main">
-              <a:graphicData uri="http://schemas.openxmlformats.org/drawingml/2006/picture">
-                <pic:pic xmlns:pic="http://schemas.openxmlformats.org/drawingml/2006/picture">
-                  <pic:nvPicPr>
-                    <pic:cNvPr id="1415261753" name="Imagen 1" descr="Texto, Carta&#10;&#10;Descripción generada automáticamente"/>
-                    <pic:cNvPicPr/>
-                  </pic:nvPicPr>
-                  <pic:blipFill>
-                    <a:blip r:embed="rId10"/>
-                    <a:stretch>
-                      <a:fillRect/>
-                    </a:stretch>
-                  </pic:blipFill>
-                  <pic:spPr>
-                    <a:xfrm>
-                      <a:off x="0" y="0"/>
-                      <a:ext cx="2715895" cy="1503045"/>
-                    </a:xfrm>
-                    <a:prstGeom prst="rect">
-                      <a:avLst/>
-                    </a:prstGeom>
-                  </pic:spPr>
-                </pic:pic>
-              </a:graphicData>
-            </a:graphic>
-            <wp14:sizeRelH relativeFrom="margin">
-              <wp14:pctWidth>0</wp14:pctWidth>
-            </wp14:sizeRelH>
-            <wp14:sizeRelV relativeFrom="margin">
-              <wp14:pctHeight>0</wp14:pctHeight>
-            </wp14:sizeRelV>
-          </wp:anchor>
-        </w:drawing>
-      </w:r>
-      <w:r>
-        <w:rPr>
           <w:noProof/>
           <w:color w:val="000000" w:themeColor="text1"/>
           <w:sz w:val="20"/>
           <w:szCs w:val="20"/>
         </w:rPr>
         <w:drawing>
-          <wp:anchor distT="0" distB="0" distL="114300" distR="114300" simplePos="0" relativeHeight="251656192" behindDoc="1" locked="0" layoutInCell="1" allowOverlap="1" wp14:anchorId="77A7C9DA" wp14:editId="6103FBB5">
+          <wp:anchor distT="0" distB="0" distL="114300" distR="114300" simplePos="0" relativeHeight="251656192" behindDoc="1" locked="0" layoutInCell="1" allowOverlap="1" wp14:anchorId="77A7C9DA" wp14:editId="49A67293">
             <wp:simplePos x="0" y="0"/>
             <wp:positionH relativeFrom="column">
-              <wp:posOffset>3240405</wp:posOffset>
+              <wp:posOffset>2927350</wp:posOffset>
             </wp:positionH>
             <wp:positionV relativeFrom="paragraph">
-              <wp:posOffset>3310890</wp:posOffset>
+              <wp:posOffset>3267075</wp:posOffset>
             </wp:positionV>
             <wp:extent cx="2783840" cy="786765"/>
             <wp:effectExtent l="0" t="0" r="0" b="0"/>
-            <wp:wrapNone/>
+            <wp:wrapThrough wrapText="bothSides">
+              <wp:wrapPolygon edited="0">
+                <wp:start x="0" y="0"/>
+                <wp:lineTo x="0" y="20920"/>
+                <wp:lineTo x="21432" y="20920"/>
+                <wp:lineTo x="21432" y="0"/>
+                <wp:lineTo x="0" y="0"/>
+              </wp:wrapPolygon>
+            </wp:wrapThrough>
             <wp:docPr id="905796915" name="Imagen 5" descr="Interfaz de usuario gráfica, Texto&#10;&#10;El contenido generado por IA puede ser incorrecto."/>
             <wp:cNvGraphicFramePr>
               <a:graphicFrameLocks xmlns:a="http://schemas.openxmlformats.org/drawingml/2006/main" noChangeAspect="1"/>
@@ -1284,7 +1265,7 @@
                     </pic:cNvPicPr>
                   </pic:nvPicPr>
                   <pic:blipFill>
-                    <a:blip r:embed="rId11">
+                    <a:blip r:embed="rId10">
                       <a:extLst>
                         <a:ext uri="{28A0092B-C50C-407E-A947-70E740481C1C}">
                           <a14:useLocalDpi xmlns:a14="http://schemas.microsoft.com/office/drawing/2010/main" val="0"/>
@@ -1324,6 +1305,70 @@
       <w:r>
         <w:rPr>
           <w:rFonts w:ascii="Arial" w:eastAsia="Calibri" w:hAnsi="Arial" w:cs="Arial"/>
+          <w:noProof/>
+          <w:lang w:val="es-PE"/>
+        </w:rPr>
+        <w:drawing>
+          <wp:anchor distT="0" distB="0" distL="114300" distR="114300" simplePos="0" relativeHeight="251660288" behindDoc="1" locked="0" layoutInCell="1" allowOverlap="1" wp14:anchorId="36059C32" wp14:editId="1B14FB28">
+            <wp:simplePos x="0" y="0"/>
+            <wp:positionH relativeFrom="margin">
+              <wp:posOffset>1050925</wp:posOffset>
+            </wp:positionH>
+            <wp:positionV relativeFrom="paragraph">
+              <wp:posOffset>647700</wp:posOffset>
+            </wp:positionV>
+            <wp:extent cx="2715895" cy="1503045"/>
+            <wp:effectExtent l="0" t="0" r="8255" b="1905"/>
+            <wp:wrapThrough wrapText="bothSides">
+              <wp:wrapPolygon edited="0">
+                <wp:start x="0" y="0"/>
+                <wp:lineTo x="0" y="21354"/>
+                <wp:lineTo x="21514" y="21354"/>
+                <wp:lineTo x="21514" y="0"/>
+                <wp:lineTo x="0" y="0"/>
+              </wp:wrapPolygon>
+            </wp:wrapThrough>
+            <wp:docPr id="1" name="Imagen 1" descr="Texto, Carta&#10;&#10;Descripción generada automáticamente"/>
+            <wp:cNvGraphicFramePr>
+              <a:graphicFrameLocks xmlns:a="http://schemas.openxmlformats.org/drawingml/2006/main" noChangeAspect="1"/>
+            </wp:cNvGraphicFramePr>
+            <a:graphic xmlns:a="http://schemas.openxmlformats.org/drawingml/2006/main">
+              <a:graphicData uri="http://schemas.openxmlformats.org/drawingml/2006/picture">
+                <pic:pic xmlns:pic="http://schemas.openxmlformats.org/drawingml/2006/picture">
+                  <pic:nvPicPr>
+                    <pic:cNvPr id="1415261753" name="Imagen 1" descr="Texto, Carta&#10;&#10;Descripción generada automáticamente"/>
+                    <pic:cNvPicPr/>
+                  </pic:nvPicPr>
+                  <pic:blipFill>
+                    <a:blip r:embed="rId11"/>
+                    <a:stretch>
+                      <a:fillRect/>
+                    </a:stretch>
+                  </pic:blipFill>
+                  <pic:spPr>
+                    <a:xfrm>
+                      <a:off x="0" y="0"/>
+                      <a:ext cx="2715895" cy="1503045"/>
+                    </a:xfrm>
+                    <a:prstGeom prst="rect">
+                      <a:avLst/>
+                    </a:prstGeom>
+                  </pic:spPr>
+                </pic:pic>
+              </a:graphicData>
+            </a:graphic>
+            <wp14:sizeRelH relativeFrom="margin">
+              <wp14:pctWidth>0</wp14:pctWidth>
+            </wp14:sizeRelH>
+            <wp14:sizeRelV relativeFrom="margin">
+              <wp14:pctHeight>0</wp14:pctHeight>
+            </wp14:sizeRelV>
+          </wp:anchor>
+        </w:drawing>
+      </w:r>
+      <w:r>
+        <w:rPr>
+          <w:rFonts w:ascii="Arial" w:eastAsia="Calibri" w:hAnsi="Arial" w:cs="Arial"/>
           <w:b/>
           <w:bCs/>
         </w:rPr>
@@ -1359,114 +1404,6 @@
           <w:lang w:val="es-ES"/>
         </w:rPr>
       </w:pPr>
-    </w:p>
-    <w:p>
-      <w:pPr>
-        <w:pStyle w:val="Textonotaalfinal"/>
-        <w:ind w:left="227" w:hanging="227"/>
-        <w:rPr>
-          <w:noProof/>
-          <w:lang w:val="es-ES"/>
-        </w:rPr>
-      </w:pPr>
-      <w:r>
-        <w:rPr>
-          <w:noProof/>
-          <w:highlight w:val="cyan"/>
-          <w:lang w:val="es-ES"/>
-        </w:rPr>
-        <w:t>(IMAGEN – DEBO COLOCAR UNA IMAGEN</w:t>
-      </w:r>
-      <w:r>
-        <w:rPr>
-          <w:noProof/>
-          <w:highlight w:val="cyan"/>
-          <w:lang w:val="es-ES"/>
-        </w:rPr>
-        <w:t xml:space="preserve"> – </w:t>
-      </w:r>
-      <w:r>
-        <w:rPr>
-          <w:b/>
-          <w:bCs/>
-          <w:noProof/>
-          <w:color w:val="EE0000"/>
-          <w:highlight w:val="cyan"/>
-          <w:lang w:val="es-ES"/>
-        </w:rPr>
-        <w:t>DEJAR ESPACIO</w:t>
-      </w:r>
-      <w:r>
-        <w:rPr>
-          <w:noProof/>
-          <w:highlight w:val="cyan"/>
-          <w:lang w:val="es-ES"/>
-        </w:rPr>
-        <w:t>)</w:t>
-      </w:r>
-    </w:p>
-    <w:p>
-      <w:pPr>
-        <w:pStyle w:val="Textonotaalfinal"/>
-        <w:ind w:left="227" w:hanging="227"/>
-        <w:rPr>
-          <w:noProof/>
-          <w:lang w:val="es-ES"/>
-        </w:rPr>
-      </w:pPr>
-    </w:p>
-    <w:p>
-      <w:pPr>
-        <w:pStyle w:val="Textonotaalfinal"/>
-        <w:ind w:left="227" w:hanging="227"/>
-        <w:rPr>
-          <w:b/>
-          <w:bCs/>
-          <w:noProof/>
-          <w:color w:val="EE0000"/>
-          <w:lang w:val="es-ES"/>
-        </w:rPr>
-      </w:pPr>
-      <w:r>
-        <w:rPr>
-          <w:b/>
-          <w:bCs/>
-          <w:noProof/>
-          <w:color w:val="EE0000"/>
-          <w:lang w:val="es-ES"/>
-        </w:rPr>
-        <w:t xml:space="preserve">APARTIR DE LA SEGUNDA </w:t>
-      </w:r>
-      <w:r>
-        <w:rPr>
-          <w:b/>
-          <w:bCs/>
-          <w:noProof/>
-          <w:color w:val="EE0000"/>
-          <w:lang w:val="es-ES"/>
-        </w:rPr>
-        <w:t xml:space="preserve">LA HOJA </w:t>
-      </w:r>
-      <w:r>
-        <w:rPr>
-          <w:b/>
-          <w:bCs/>
-          <w:noProof/>
-          <w:color w:val="EE0000"/>
-          <w:lang w:val="es-ES"/>
-        </w:rPr>
-        <w:t xml:space="preserve">ES </w:t>
-      </w:r>
-      <w:r>
-        <w:rPr>
-          <w:b/>
-          <w:bCs/>
-          <w:noProof/>
-          <w:color w:val="EE0000"/>
-          <w:lang w:val="es-ES"/>
-        </w:rPr>
-        <w:t>DE COSTADITO :P</w:t>
-      </w:r>
     </w:p>
     <w:p>
       <w:pPr>
@@ -1491,32 +1428,119 @@
     </w:p>
     <w:p>
       <w:pPr>
-        <w:rPr>
-          <w:rFonts w:ascii="Verdana" w:hAnsi="Verdana"/>
+        <w:widowControl/>
+        <w:tabs>
+          <w:tab w:val="left" w:pos="7938"/>
+        </w:tabs>
+        <w:autoSpaceDE/>
+        <w:autoSpaceDN/>
+        <w:spacing w:line="276" w:lineRule="auto"/>
+        <w:jc w:val="both"/>
+        <w:rPr>
+          <w:rFonts w:ascii="Arial" w:eastAsia="Calibri" w:hAnsi="Arial" w:cs="Arial"/>
+          <w:b/>
+          <w:bCs/>
+        </w:rPr>
+      </w:pPr>
+      <w:r>
+        <w:rPr>
+          <w:rFonts w:ascii="Arial" w:hAnsi="Arial" w:cs="Arial"/>
           <w:color w:val="000000" w:themeColor="text1"/>
-          <w:sz w:val="16"/>
-          <w:szCs w:val="16"/>
-        </w:rPr>
-      </w:pPr>
-      <w:r>
-        <w:rPr>
+        </w:rPr>
+        <w:t>Lima,</w:t>
+      </w:r>
+      <w:r>
+        <w:rPr>
+          <w:color w:val="000000" w:themeColor="text1"/>
+          <w:spacing w:val="1"/>
+          <w:sz w:val="20"/>
+          <w:szCs w:val="20"/>
+        </w:rPr>
+        <w:t xml:space="preserve"> </w:t>
+      </w:r>
+      <w:r>
+        <w:rPr>
+          <w:rFonts w:ascii="Arial" w:eastAsia="Calibri" w:hAnsi="Arial" w:cs="Arial"/>
+        </w:rPr>
+        <w:t>${</w:t>
+      </w:r>
+      <w:proofErr w:type="spellStart"/>
+      <w:r>
+        <w:rPr>
+          <w:rFonts w:ascii="Arial" w:eastAsia="Calibri" w:hAnsi="Arial" w:cs="Arial"/>
+          <w:lang w:val="es-PE"/>
+        </w:rPr>
+        <w:t>fechaCiei</w:t>
+      </w:r>
+      <w:proofErr w:type="spellEnd"/>
+      <w:r>
+        <w:rPr>
+          <w:rFonts w:ascii="Arial" w:eastAsia="Calibri" w:hAnsi="Arial" w:cs="Arial"/>
+        </w:rPr>
+        <w:t>}</w:t>
+      </w:r>
+    </w:p>
+    <w:p>
+      <w:pPr>
+        <w:rPr>
+          <w:b/>
+          <w:bCs/>
+          <w:color w:val="EE0000"/>
+          <w:sz w:val="20"/>
+          <w:szCs w:val="20"/>
+          <w:lang w:val="es-PE"/>
+        </w:rPr>
+      </w:pPr>
+    </w:p>
+    <w:p>
+      <w:pPr>
+        <w:rPr>
+          <w:b/>
+          <w:bCs/>
+          <w:color w:val="EE0000"/>
+          <w:sz w:val="20"/>
+          <w:szCs w:val="20"/>
+          <w:lang w:val="es-PE"/>
+        </w:rPr>
+      </w:pPr>
+    </w:p>
+    <w:p>
+      <w:pPr>
+        <w:rPr>
+          <w:b/>
+          <w:bCs/>
+          <w:color w:val="EE0000"/>
+          <w:sz w:val="20"/>
+          <w:szCs w:val="20"/>
+          <w:lang w:val="es-PE"/>
+        </w:rPr>
+      </w:pPr>
+      <w:r>
+        <w:rPr>
+          <w:rFonts w:ascii="Arial" w:hAnsi="Arial" w:cs="Arial"/>
           <w:noProof/>
           <w:color w:val="000000" w:themeColor="text1"/>
-          <w:sz w:val="20"/>
-          <w:szCs w:val="20"/>
         </w:rPr>
         <w:drawing>
-          <wp:anchor distT="0" distB="0" distL="114300" distR="114300" simplePos="0" relativeHeight="251660800" behindDoc="0" locked="0" layoutInCell="1" allowOverlap="1" wp14:anchorId="03147A24" wp14:editId="25294272">
+          <wp:anchor distT="0" distB="0" distL="114300" distR="114300" simplePos="0" relativeHeight="251659776" behindDoc="0" locked="0" layoutInCell="1" allowOverlap="1" wp14:anchorId="03147A24" wp14:editId="258A1C77">
             <wp:simplePos x="0" y="0"/>
             <wp:positionH relativeFrom="margin">
-              <wp:posOffset>2876550</wp:posOffset>
+              <wp:posOffset>1400175</wp:posOffset>
             </wp:positionH>
             <wp:positionV relativeFrom="paragraph">
-              <wp:posOffset>3676015</wp:posOffset>
+              <wp:posOffset>14605</wp:posOffset>
             </wp:positionV>
             <wp:extent cx="2797520" cy="1548286"/>
             <wp:effectExtent l="0" t="0" r="3175" b="0"/>
-            <wp:wrapNone/>
+            <wp:wrapThrough wrapText="bothSides">
+              <wp:wrapPolygon edited="0">
+                <wp:start x="0" y="0"/>
+                <wp:lineTo x="0" y="21263"/>
+                <wp:lineTo x="21477" y="21263"/>
+                <wp:lineTo x="21477" y="0"/>
+                <wp:lineTo x="0" y="0"/>
+              </wp:wrapPolygon>
+            </wp:wrapThrough>
             <wp:docPr id="658076145" name="Imagen 1" descr="Texto, Carta&#10;&#10;Descripción generada automáticamente"/>
             <wp:cNvGraphicFramePr>
               <a:graphicFrameLocks xmlns:a="http://schemas.openxmlformats.org/drawingml/2006/main" noChangeAspect="1"/>
@@ -1529,7 +1553,7 @@
                     <pic:cNvPicPr/>
                   </pic:nvPicPr>
                   <pic:blipFill>
-                    <a:blip r:embed="rId10"/>
+                    <a:blip r:embed="rId11"/>
                     <a:stretch>
                       <a:fillRect/>
                     </a:stretch>
@@ -1555,83 +1579,9 @@
           </wp:anchor>
         </w:drawing>
       </w:r>
-      <w:r>
-        <w:rPr>
-          <w:color w:val="000000" w:themeColor="text1"/>
-          <w:sz w:val="20"/>
-          <w:szCs w:val="20"/>
-        </w:rPr>
-        <w:t>Lima,</w:t>
-      </w:r>
-      <w:r>
-        <w:rPr>
-          <w:color w:val="000000" w:themeColor="text1"/>
-          <w:spacing w:val="1"/>
-          <w:sz w:val="20"/>
-          <w:szCs w:val="20"/>
-        </w:rPr>
-        <w:t xml:space="preserve"> </w:t>
-      </w:r>
-      <w:r>
-        <w:rPr>
-          <w:color w:val="EE0000"/>
-          <w:sz w:val="20"/>
-          <w:szCs w:val="20"/>
-        </w:rPr>
-        <w:t>21 de</w:t>
-      </w:r>
-      <w:r>
-        <w:rPr>
-          <w:color w:val="EE0000"/>
-          <w:spacing w:val="-1"/>
-          <w:sz w:val="20"/>
-          <w:szCs w:val="20"/>
-        </w:rPr>
-        <w:t xml:space="preserve"> agosto</w:t>
-      </w:r>
-      <w:r>
-        <w:rPr>
-          <w:color w:val="EE0000"/>
-          <w:spacing w:val="-3"/>
-          <w:sz w:val="20"/>
-          <w:szCs w:val="20"/>
-        </w:rPr>
-        <w:t xml:space="preserve"> </w:t>
-      </w:r>
-      <w:r>
-        <w:rPr>
-          <w:color w:val="EE0000"/>
-          <w:sz w:val="20"/>
-          <w:szCs w:val="20"/>
-        </w:rPr>
-        <w:t>del</w:t>
-      </w:r>
-      <w:r>
-        <w:rPr>
-          <w:color w:val="EE0000"/>
-          <w:spacing w:val="-1"/>
-          <w:sz w:val="20"/>
-          <w:szCs w:val="20"/>
-        </w:rPr>
-        <w:t xml:space="preserve"> </w:t>
-      </w:r>
-      <w:r>
-        <w:rPr>
-          <w:color w:val="EE0000"/>
-          <w:sz w:val="20"/>
-          <w:szCs w:val="20"/>
-        </w:rPr>
-        <w:t>2026</w:t>
-      </w:r>
-      <w:r>
-        <w:rPr>
-          <w:color w:val="EE0000"/>
-          <w:sz w:val="20"/>
-          <w:szCs w:val="20"/>
-        </w:rPr>
-        <w:t xml:space="preserve"> </w:t>
-      </w:r>
-      <w:r>
+    </w:p>
+    <w:p>
+      <w:pPr>
         <w:rPr>
           <w:b/>
           <w:bCs/>
@@ -1640,9 +1590,10 @@
           <w:szCs w:val="20"/>
           <w:lang w:val="es-PE"/>
         </w:rPr>
-        <w:t>COLUMNA-</w:t>
-      </w:r>
-      <w:r>
+      </w:pPr>
+    </w:p>
+    <w:p>
+      <w:pPr>
         <w:rPr>
           <w:b/>
           <w:bCs/>
@@ -1651,8 +1602,113 @@
           <w:szCs w:val="20"/>
           <w:lang w:val="es-PE"/>
         </w:rPr>
-        <w:t>R-T-V</w:t>
-      </w:r>
+      </w:pPr>
+    </w:p>
+    <w:p>
+      <w:pPr>
+        <w:rPr>
+          <w:b/>
+          <w:bCs/>
+          <w:color w:val="EE0000"/>
+          <w:sz w:val="20"/>
+          <w:szCs w:val="20"/>
+          <w:lang w:val="es-PE"/>
+        </w:rPr>
+      </w:pPr>
+    </w:p>
+    <w:p>
+      <w:pPr>
+        <w:rPr>
+          <w:b/>
+          <w:bCs/>
+          <w:color w:val="EE0000"/>
+          <w:sz w:val="20"/>
+          <w:szCs w:val="20"/>
+          <w:lang w:val="es-PE"/>
+        </w:rPr>
+      </w:pPr>
+    </w:p>
+    <w:p>
+      <w:pPr>
+        <w:rPr>
+          <w:b/>
+          <w:bCs/>
+          <w:color w:val="EE0000"/>
+          <w:sz w:val="20"/>
+          <w:szCs w:val="20"/>
+          <w:lang w:val="es-PE"/>
+        </w:rPr>
+      </w:pPr>
+    </w:p>
+    <w:p>
+      <w:pPr>
+        <w:rPr>
+          <w:b/>
+          <w:bCs/>
+          <w:color w:val="EE0000"/>
+          <w:sz w:val="20"/>
+          <w:szCs w:val="20"/>
+          <w:lang w:val="es-PE"/>
+        </w:rPr>
+      </w:pPr>
+    </w:p>
+    <w:p>
+      <w:pPr>
+        <w:rPr>
+          <w:b/>
+          <w:bCs/>
+          <w:color w:val="EE0000"/>
+          <w:sz w:val="20"/>
+          <w:szCs w:val="20"/>
+          <w:lang w:val="es-PE"/>
+        </w:rPr>
+      </w:pPr>
+    </w:p>
+    <w:p>
+      <w:pPr>
+        <w:rPr>
+          <w:b/>
+          <w:bCs/>
+          <w:color w:val="EE0000"/>
+          <w:sz w:val="20"/>
+          <w:szCs w:val="20"/>
+          <w:lang w:val="es-PE"/>
+        </w:rPr>
+      </w:pPr>
+    </w:p>
+    <w:p>
+      <w:pPr>
+        <w:rPr>
+          <w:b/>
+          <w:bCs/>
+          <w:color w:val="EE0000"/>
+          <w:sz w:val="20"/>
+          <w:szCs w:val="20"/>
+          <w:lang w:val="es-PE"/>
+        </w:rPr>
+      </w:pPr>
+    </w:p>
+    <w:p>
+      <w:pPr>
+        <w:rPr>
+          <w:b/>
+          <w:bCs/>
+          <w:color w:val="EE0000"/>
+          <w:sz w:val="20"/>
+          <w:szCs w:val="20"/>
+          <w:lang w:val="es-PE"/>
+        </w:rPr>
+      </w:pPr>
+    </w:p>
+    <w:p>
+      <w:pPr>
+        <w:rPr>
+          <w:rFonts w:ascii="Verdana" w:hAnsi="Verdana"/>
+          <w:color w:val="000000" w:themeColor="text1"/>
+          <w:sz w:val="16"/>
+          <w:szCs w:val="16"/>
+        </w:rPr>
+      </w:pPr>
     </w:p>
     <w:sectPr>
       <w:headerReference w:type="default" r:id="rId12"/>

</xml_diff>